<commit_message>
Finishing touches on May 2026 - intro blog plus a minor change to A2D by eliminating an extra word missed in original edit
</commit_message>
<xml_diff>
--- a/Posts/2026/05(May)/Aristotle2Digital/A2D_05(May)_2026_Sympy_05.docx
+++ b/Posts/2026/05(May)/Aristotle2Digital/A2D_05(May)_2026_Sympy_05.docx
@@ -1324,9 +1324,6 @@
         <w:t xml:space="preserve">e </w:t>
       </w:r>
       <w:r>
-        <w:t xml:space="preserve">tree </w:t>
-      </w:r>
-      <w:r>
         <w:t>a</w:t>
       </w:r>
       <w:r>
@@ -2075,18 +2072,15 @@
         <w:t>ric mat</w:t>
       </w:r>
       <w:r>
-        <w:t>ching</w:t>
+        <w:t xml:space="preserve">ching </w:t>
+      </w:r>
+      <w:r>
+        <w:t>for</w:t>
       </w:r>
       <w:r>
         <w:t xml:space="preserve"> </w:t>
       </w:r>
       <w:r>
-        <w:t>for</w:t>
-      </w:r>
-      <w:r>
-        <w:t xml:space="preserve"> </w:t>
-      </w:r>
-      <w:r>
         <w:t>symbo</w:t>
       </w:r>
       <w:r>
@@ -2111,10 +2105,7 @@
         <w:t>cla</w:t>
       </w:r>
       <w:r>
-        <w:t>ss</w:t>
-      </w:r>
-      <w:r>
-        <w:t xml:space="preserve"> </w:t>
+        <w:t xml:space="preserve">ss </w:t>
       </w:r>
       <w:r>
         <w:t>(</w:t>
@@ -2770,10 +2761,7 @@
         <w:t>ance</w:t>
       </w:r>
       <w:r>
-        <w:t xml:space="preserve">s of </w:t>
-      </w:r>
-      <w:r>
-        <w:t>th</w:t>
+        <w:t>s of th</w:t>
       </w:r>
       <w:r>
         <w:t xml:space="preserve">e </w:t>
@@ -5617,6 +5605,7 @@
   <w:style w:type="character" w:default="1" w:styleId="DefaultParagraphFont">
     <w:name w:val="Default Paragraph Font"/>
     <w:uiPriority w:val="1"/>
+    <w:semiHidden/>
     <w:unhideWhenUsed/>
   </w:style>
   <w:style w:type="table" w:default="1" w:styleId="TableNormal">

</xml_diff>